<commit_message>
Default UNI-2 sampling to tissue grid
</commit_message>
<xml_diff>
--- a/Manuscript/CellPhenotyper revised 170926 VSI RGB input formats.docx
+++ b/Manuscript/CellPhenotyper revised 170926 VSI RGB input formats.docx
@@ -628,7 +628,7 @@
           <w:b/>
           <w:sz w:val="24"/>
         </w:rPr>
-        <w:t>Routine H&amp;E whole-slide imaging captures rich cellular and tissue architecture, but reproducible transformation of gigapixel histology into spatial single-cell data remains challenging. Here, we present CellPhenotyper, a modular Nextflow pipeline integrating artifact-aware quality control, three-model consensus cell identification, tissue-microarray-aware assignment, virtual-marker inference, paired cell-centred morphology embeddings, scalable unsupervised phenotyping and anatomically guided tissue refinement. CellPhenotyper combines GrandQC, StarDist, HoVer-Net MoNuSAC, CellViT++, GigaTIME, UNI-2, KODAMA, Leiden clustering and MedSAM in containerized, hardware-aware workflows. After final tissue-compartment vectorization, the pipeline selects the connected section containing the largest number of CellViT++-identified neoplastic consensus cells, derives a 768-dimensional section representation with TITAN and CONCH, and supplies it to cancer-specific PathoFMPred models. The workflow produces traceable cell masks, named cell types, virtual-marker measurements, learned representations, phenotype assignments, refined tissue compartments and section-level molecular predictions from routine H&amp;E images.</w:t>
+        <w:t>Routine H&amp;E whole-slide imaging captures rich cellular and tissue architecture, but reproducible transformation of gigapixel histology into spatial single-cell data remains challenging. Here, we present CellPhenotyper, a modular Nextflow pipeline integrating artifact-aware quality control, three-model consensus cell identification, tissue-microarray-aware assignment, virtual-marker inference, paired spatial-grid morphology embeddings, scalable unsupervised phenotyping and anatomically guided tissue refinement. CellPhenotyper combines GrandQC, StarDist, HoVer-Net MoNuSAC, CellViT++, GigaTIME, UNI-2, KODAMA, Leiden clustering and MedSAM in containerized, hardware-aware workflows. After final tissue-compartment vectorization, the pipeline selects the connected section containing the largest number of CellViT++-identified neoplastic consensus cells, derives a 768-dimensional section representation with TITAN and CONCH, and supplies it to cancer-specific PathoFMPred models. The workflow produces traceable cell masks, named cell types, virtual-marker measurements, learned representations, phenotype assignments, refined tissue compartments and section-level molecular predictions from routine H&amp;E images.</w:t>
       </w:r>
     </w:p>
     <w:p>
@@ -2401,7 +2401,7 @@
           <w:b w:val="0"/>
           <w:sz w:val="24"/>
         </w:rPr>
-        <w:t>In parallel, CellPhenotyper extracts resolution-calibrated, cell-centred image tiles for UNI-2. A single UNI-2-h forward pass generates two complementary representations: the full-tile vector from CLS-token pooling and an inner-square vector obtained by averaging patch tokens whose centres fall within a fixed 90-pixel square in the 224 x 224 model input. This token-subsetting implementation avoids a second masked-image forward pass while preserving local and contextual morphology [17].</w:t>
+        <w:t>By default, CellPhenotyper extracts resolution-calibrated image tiles on a regular GrandQC-filtered tissue grid for UNI-2, without executing the cell-centred route. A single UNI-2-h forward pass generates two complementary representations for each spatial observation: the full-tile vector from CLS-token pooling and an inner-square vector obtained by averaging patch tokens whose centres fall within a fixed 90-pixel square in the 224 x 224 model input. This token-subsetting implementation avoids a second masked-image forward pass while preserving local and contextual morphology [17]. Nucleus-centred sampling remains available only as an explicit alternative or paired comparison route.</w:t>
       </w:r>
     </w:p>
     <w:p>
@@ -2424,7 +2424,7 @@
           <w:b w:val="0"/>
           <w:sz w:val="24"/>
         </w:rPr>
-        <w:t>For unsupervised phenotyping, spatial feature selection is applied separately to the tile and inner-square representations, the retained features are combined and reduced to 20 principal components, and raw embedding matrices are released from memory. KODAMA learns a nonlinear visualization using landmarks [18]. For large cell populations, Leiden clustering is performed on inverse-density-weighted landmarks and labels for the remaining cells are propagated by k-nearest neighbours, providing scalable clustering without constructing a full all-cell graph.</w:t>
+        <w:t>For unsupervised phenotyping, spatial feature selection is applied separately to the tile and inner-square representations, the retained features are combined and reduced to 20 principal components, and raw embedding matrices are released from memory. KODAMA learns a nonlinear visualization using landmarks [18]. For large observation sets, Leiden clustering is performed on inverse-density-weighted landmarks and labels for the remaining observations are propagated by k-nearest neighbours, providing scalable clustering without constructing a full all-observation graph.</w:t>
       </w:r>
     </w:p>
     <w:p>
@@ -2453,7 +2453,7 @@
           <w:b w:val="0"/>
           <w:sz w:val="24"/>
         </w:rPr>
-        <w:t>Cluster assignments are projected back through the consensus-cell and cytoplasm masks to produce spatial cluster maps. Tissue-constrained growth converts sparse cell labels into continuous compartment candidates, and MedSAM refines only their editable borders while preserving cluster seeds [19]. The refined masks are exported as pyramidal OME-TIFF, full-resolution quality-control panels and class-aware GeoJSON. Connected tissue sections are then ranked by the number of consensus cells carrying the named CellViT++ neoplastic class. The selected section is encoded by TITAN using CONCH v1.5 patch features, and its slide-level representation can be analysed by a cancer-specific PathoFMPred model [29,30]. All stages are orchestrated by Nextflow DSL2 with resumable execution, containerized dependencies, hardware-aware CPU, RAM and GPU allocation, execution traces and a project-wide output catalogue.</w:t>
+        <w:t>For the default grid route, cluster assignments are rasterized across adjacent inner cores to produce a dense spatial cluster map, which proceeds directly to MedSAM without cell-seeded tissue growth. If the cell-centred route is selected explicitly, cluster assignments are projected through the consensus-cell and cytoplasm masks and tissue-constrained growth converts sparse labels into continuous compartment candidates. MedSAM refines editable borders while preserving cluster seeds [19]. Refined masks are exported as pyramidal OME-TIFF, full-resolution quality-control panels and class-aware GeoJSON. Connected tissue sections are then ranked by the number of consensus cells carrying the named CellViT++ neoplastic class. The selected section is encoded by TITAN using CONCH v1.5 patch features, and its slide-level representation can be analysed by a cancer-specific PathoFMPred model [29,30]. All stages are orchestrated by Nextflow DSL2 with resumable execution, containerized dependencies, hardware-aware CPU, RAM and GPU allocation, execution traces and a project-wide output catalogue.</w:t>
       </w:r>
     </w:p>
     <w:p>
@@ -2843,7 +2843,7 @@
           <w:b w:val="0"/>
           <w:sz w:val="24"/>
         </w:rPr>
-        <w:t>UNI-2 tile and inner-square embeddings were generated together from cell-centred inputs (Figure 1e), analysed using KODAMA and clustered with a landmark-based Leiden procedure (Figure 1f). Inverse-distance landmark sampling emphasized locally dense regions of the KODAMA visualization, after which k-nearest-neighbour voting assigned the remaining cells. Cluster-informed outputs were then projected into image space.</w:t>
+        <w:t>UNI-2 tile and inner-square embeddings were generated together from regular GrandQC-filtered spatial-grid inputs by default (Figure 1e), analysed using KODAMA and clustered with a landmark-based Leiden procedure (Figure 1f). Inverse-distance landmark sampling emphasized locally dense regions of the KODAMA visualization, after which k-nearest-neighbour voting assigned the remaining observations. Cluster labels were then projected into image space. The cell-centred route was not executed unless explicitly selected.</w:t>
       </w:r>
     </w:p>
     <w:p>
@@ -2870,7 +2870,7 @@
           <w:b w:val="0"/>
           <w:sz w:val="24"/>
         </w:rPr>
-        <w:t>The final workflow outputs include GrandQC artifact annotations, three-model consensus cell masks and named type provenance, TMA spot assignments, multichannel pyramidal GigaTIME images, per-cell marker tables, paired UNI-2 embeddings, KODAMA coordinates, Leiden cluster assignments, cluster and grown-tissue masks, MedSAM quality-control panels, non-overlapping class-aware GeoJSON polygons, a neoplastic-cell-ranked tissue-section crop, CONCH patch features, a 768-dimensional TITAN embedding and PathoFMPred research reports (Figure 1g).</w:t>
+        <w:t>The final workflow outputs include GrandQC artifact annotations, three-model consensus cell masks and named type provenance, TMA spot assignments, multichannel pyramidal GigaTIME images, per-cell marker tables, paired spatial-grid UNI-2 embeddings, KODAMA coordinates, Leiden cluster assignments, cluster and grown-tissue masks, MedSAM quality-control panels, non-overlapping class-aware GeoJSON polygons, a neoplastic-cell-ranked tissue-section crop, CONCH patch features, a 768-dimensional TITAN embedding and PathoFMPred research reports (Figure 1g).</w:t>
       </w:r>
     </w:p>
     <w:p>
@@ -3284,14 +3284,14 @@
           <w:b/>
           <w:sz w:val="24"/>
         </w:rPr>
-        <w:t xml:space="preserve">Cell-centred tiling: </w:t>
-      </w:r>
-      <w:r>
-        <w:rPr>
-          <w:rFonts w:ascii="Times New Roman" w:hAnsi="Times New Roman"/>
-          <w:sz w:val="24"/>
-        </w:rPr>
-        <w:t>One tile was centred on each consensus-cell coordinate. Source crops were calibrated to 0.25 micrometres per pixel by default and transformed to the 224 x 224 UNI-2-h input. Tiles were streamed in buckets and batches; PNG export was disabled by default because downstream analysis consumes embedding tables directly.</w:t>
+        <w:t xml:space="preserve">Spatial-grid tiling: </w:t>
+      </w:r>
+      <w:r>
+        <w:rPr>
+          <w:rFonts w:ascii="Times New Roman" w:hAnsi="Times New Roman"/>
+          <w:sz w:val="24"/>
+        </w:rPr>
+        <w:t xml:space="preserve"> By default, tile centres were placed on a regular grid within GrandQC-clean tissue; the calibrated 90-pixel inner cores were adjacent while the surrounding 224 x 224 UNI-2-h context fields overlapped. Source crops were calibrated to 0.25 micrometres per pixel. Tiles were streamed in buckets and batches, and PNG export was disabled by default because downstream KODAMA analysis consumes embedding tables directly. Cell-centred tiling required explicit selection of the cells or both sampling mode.</w:t>
       </w:r>
     </w:p>
     <w:p>
@@ -3340,7 +3340,7 @@
           <w:b w:val="0"/>
           <w:sz w:val="24"/>
         </w:rPr>
-        <w:t>For each cell, the primary tile representation was obtained from CLS-token pooling. In the same forward pass, the inner_square representation was generated by selecting patch tokens whose centres fell within a centred 90-pixel square in the 224 x 224 model input and averaging those tokens. Thus, inner_square was neither a cytoplasm mask nor a second masked-image forward pass.</w:t>
+        <w:t>For each spatial-grid observation, the primary tile representation was obtained from CLS-token pooling. In the same forward pass, the inner_square representation was generated by selecting patch tokens whose centres fell within a centred 90-pixel square in the 224 x 224 model input and averaging those tokens. Thus, inner_square was neither a cytoplasm mask nor a second masked-image forward pass.</w:t>
       </w:r>
     </w:p>
     <w:p>
@@ -3358,7 +3358,7 @@
           <w:b w:val="0"/>
           <w:sz w:val="24"/>
         </w:rPr>
-        <w:t>The paired token-subsetting implementation produced aligned 1,536-dimensional tile and inner-square vectors with the same canonical cell identifiers. Checkpoint markers and bucket-level outputs allowed interrupted extraction to resume from the last completed bucket rather than recomputing all cells.</w:t>
+        <w:t>The paired token-subsetting implementation produced aligned 1,536-dimensional tile and inner-square vectors with the same spatial-observation identifiers. Checkpoint markers and bucket-level outputs allowed interrupted extraction to resume from the last completed bucket rather than recomputing all observations.</w:t>
       </w:r>
     </w:p>
     <w:p>
@@ -3376,90 +3376,91 @@
           <w:b/>
           <w:sz w:val="24"/>
         </w:rPr>
-        <w:t xml:space="preserve">KODAMA representation learning: </w:t>
-      </w:r>
-      <w:r>
-        <w:rPr>
-          <w:rFonts w:ascii="Times New Roman" w:hAnsi="Times New Roman"/>
-          <w:sz w:val="24"/>
-        </w:rPr>
-        <w:t>Tile and inner-square matrices were aligned by canonical cell ID. KODAMA spatial feature selection ranked features from each family using cell coordinates; the top 100 features per family were retained, with variance ranking used only as a fallback [18]. The selected matrices were combined, centred, scaled and reduced to exactly 20 principal components. Raw embedding matrices were deleted from the R session after PCA to reduce peak RAM.</w:t>
-      </w:r>
-    </w:p>
-    <w:p>
-      <w:pPr>
-        <w:jc w:val="both"/>
-        <w:rPr>
-          <w:rFonts w:ascii="Times New Roman" w:eastAsia="Times New Roman" w:hAnsi="Times New Roman" w:cs="Times New Roman"/>
-          <w:sz w:val="24"/>
-          <w:szCs w:val="24"/>
-        </w:rPr>
-      </w:pPr>
+        <w:t>KODAMA representation learning:</w:t>
+      </w:r>
       <w:r>
         <w:rPr>
           <w:rFonts w:ascii="Times New Roman" w:hAnsi="Times New Roman"/>
           <w:b w:val="0"/>
           <w:sz w:val="24"/>
         </w:rPr>
-        <w:t>KODAMA was run on the PCA representation with spatial coordinates, 1,000 internal landmarks and a two-component internal optimization. For cell populations above the exact-analysis threshold, KODAMA was fitted to a reproducible subset and the remaining cells were projected from PCA space by nearest-neighbour interpolation. The resulting two-dimensional visualization retained canonical cell identifiers.</w:t>
-      </w:r>
-    </w:p>
-    <w:p>
-      <w:pPr>
-        <w:jc w:val="both"/>
-        <w:rPr>
-          <w:rFonts w:ascii="Times New Roman" w:eastAsia="Times New Roman" w:hAnsi="Times New Roman" w:cs="Times New Roman"/>
-          <w:sz w:val="24"/>
-          <w:szCs w:val="24"/>
-        </w:rPr>
-      </w:pPr>
-      <w:proofErr w:type="spellStart"/>
-      <w:proofErr w:type="spellEnd"/>
+        <w:t xml:space="preserve"> Tile and inner-square matrices were aligned by spatial-observation ID. KODAMA spatial feature selection ranked features from each family using grid coordinates; the top 100 features per family were retained, with variance ranking used only as a fallback [18]. The selected matrices were combined, centred, scaled and reduced to exactly 20 principal components. Raw embedding matrices were deleted from the R session after PCA to reduce peak RAM.</w:t>
+      </w:r>
+    </w:p>
+    <w:p>
+      <w:pPr>
+        <w:jc w:val="both"/>
+        <w:rPr>
+          <w:rFonts w:ascii="Times New Roman" w:eastAsia="Times New Roman" w:hAnsi="Times New Roman" w:cs="Times New Roman"/>
+          <w:sz w:val="24"/>
+          <w:szCs w:val="24"/>
+        </w:rPr>
+      </w:pPr>
       <w:r>
         <w:rPr>
           <w:rFonts w:ascii="Times New Roman" w:hAnsi="Times New Roman"/>
           <w:b w:val="0"/>
           <w:sz w:val="24"/>
         </w:rPr>
-        <w:t>Clustering was performed on the KODAMA visualization using Leiden community detection. Ten thousand landmarks were sampled with probability proportional to the inverse square of each cell’s mean distance to its 50 nearest neighbours. A 50-neighbour graph was constructed on landmarks at resolution 0.3, and labels for non-landmark cells were assigned by 50-nearest-neighbour voting using Rnanoflann. This strategy avoided constructing an all-cell graph for very large slides.</w:t>
-      </w:r>
-    </w:p>
-    <w:p>
-      <w:pPr>
-        <w:jc w:val="both"/>
-        <w:rPr>
-          <w:rFonts w:ascii="Times New Roman" w:eastAsia="Times New Roman" w:hAnsi="Times New Roman" w:cs="Times New Roman"/>
-          <w:sz w:val="24"/>
-          <w:szCs w:val="24"/>
-        </w:rPr>
-      </w:pPr>
+        <w:t>KODAMA was run on the PCA representation with spatial coordinates, 1,000 internal landmarks and a two-component internal optimization. For observation sets above the exact-analysis threshold, KODAMA was fitted to a reproducible subset and the remaining observations were projected from PCA space by nearest-neighbour interpolation. The resulting two-dimensional visualization retained canonical spatial-observation identifiers.</w:t>
+      </w:r>
+    </w:p>
+    <w:p>
+      <w:pPr>
+        <w:jc w:val="both"/>
+        <w:rPr>
+          <w:rFonts w:ascii="Times New Roman" w:eastAsia="Times New Roman" w:hAnsi="Times New Roman" w:cs="Times New Roman"/>
+          <w:sz w:val="24"/>
+          <w:szCs w:val="24"/>
+        </w:rPr>
+      </w:pPr>
+      <w:proofErr w:type="spellStart"/>
+      <w:proofErr w:type="spellEnd"/>
       <w:r>
         <w:rPr>
           <w:rFonts w:ascii="Times New Roman" w:hAnsi="Times New Roman"/>
           <w:b w:val="0"/>
           <w:sz w:val="24"/>
         </w:rPr>
-        <w:t>Projection of cell clusters into image space: Cluster labels were joined to canonical consensus IDs and mapped through the cytoplasm-associated label image. This generated a spatial cluster mask while preserving the link among model provenance, virtual markers, UNI-2 embeddings, KODAMA coordinates and phenotype assignments.</w:t>
-      </w:r>
-    </w:p>
-    <w:p>
-      <w:pPr>
-        <w:jc w:val="both"/>
-        <w:rPr>
-          <w:rFonts w:ascii="Times New Roman" w:eastAsia="Times New Roman" w:hAnsi="Times New Roman" w:cs="Times New Roman"/>
-          <w:sz w:val="24"/>
-          <w:szCs w:val="24"/>
-        </w:rPr>
-      </w:pPr>
-      <w:proofErr w:type="spellStart"/>
-      <w:proofErr w:type="spellEnd"/>
+        <w:t>Clustering was performed on the KODAMA visualization using Leiden community detection. Ten thousand landmarks were sampled with probability proportional to the inverse square of each observation's mean distance to its 50 nearest neighbours. A 50-neighbour graph was constructed on landmarks at resolution 0.3, and labels for non-landmark observations were assigned by 50-nearest-neighbour voting using Rnanoflann. This strategy avoided constructing an all-observation graph for very large slides.</w:t>
+      </w:r>
+    </w:p>
+    <w:p>
+      <w:pPr>
+        <w:jc w:val="both"/>
+        <w:rPr>
+          <w:rFonts w:ascii="Times New Roman" w:eastAsia="Times New Roman" w:hAnsi="Times New Roman" w:cs="Times New Roman"/>
+          <w:sz w:val="24"/>
+          <w:szCs w:val="24"/>
+        </w:rPr>
+      </w:pPr>
       <w:r>
         <w:rPr>
           <w:rFonts w:ascii="Times New Roman" w:hAnsi="Times New Roman"/>
           <w:b w:val="0"/>
           <w:sz w:val="24"/>
         </w:rPr>
-        <w:t>Grown-tissue reconstruction: Cluster seeds were expanded only within the tissue mask, preserving cluster identities while filling unassigned tissue by nearest seeded labels and morphological regularization. All connected tissue components were retained by default so TMA cores and fragmented specimens were not discarded.</w:t>
+        <w:t>Projection of clusters into image space: For the default grid route, cluster labels were joined to spatial-observation identifiers and rasterized across adjacent inner cores to form a dense cluster mask. The optional cell-centred route instead joined labels to canonical consensus IDs and mapped them through the cytoplasm-associated label image. Both routes preserved links among model provenance, UNI-2 embeddings, KODAMA coordinates and phenotype assignments.</w:t>
+      </w:r>
+    </w:p>
+    <w:p>
+      <w:pPr>
+        <w:jc w:val="both"/>
+        <w:rPr>
+          <w:rFonts w:ascii="Times New Roman" w:eastAsia="Times New Roman" w:hAnsi="Times New Roman" w:cs="Times New Roman"/>
+          <w:sz w:val="24"/>
+          <w:szCs w:val="24"/>
+        </w:rPr>
+      </w:pPr>
+      <w:proofErr w:type="spellStart"/>
+      <w:proofErr w:type="spellEnd"/>
+      <w:r>
+        <w:rPr>
+          <w:rFonts w:ascii="Times New Roman" w:hAnsi="Times New Roman"/>
+          <w:b w:val="0"/>
+          <w:sz w:val="24"/>
+        </w:rPr>
+        <w:t>Grown-tissue reconstruction: This stage is skipped by the default grid route because adjacent inner cores already produce a dense tissue-domain mask. When the cell-centred route is selected explicitly, sparse cluster seeds are expanded only within the tissue mask, preserving cluster identities while filling unassigned tissue by nearest seeded labels and morphological regularization. All connected tissue components are retained so TMA cores and fragmented specimens are not discarded.</w:t>
       </w:r>
     </w:p>
     <w:p>
@@ -3520,7 +3521,7 @@
           <w:b w:val="0"/>
           <w:sz w:val="24"/>
         </w:rPr>
-        <w:t>The H&amp;E crop, cluster seed mask and grown-tissue mask jointly constrained refinement. Core seed pixels were protected, whereas a configurable boundary band allowed MedSAM to add, remove or relabel pixels. Cluster labels were processed independently, including tiles containing only one cluster, before overlap resolution and conservative morphological cleanup.</w:t>
+        <w:t>The H&amp;E crop, cluster seed mask and route-specific baseline mask jointly constrained refinement. Core seed pixels were protected, whereas a configurable boundary band allowed MedSAM to add, remove or relabel pixels. Cluster labels were processed independently, including tiles containing only one cluster, before overlap resolution and conservative morphological cleanup.</w:t>
       </w:r>
     </w:p>
     <w:p>
@@ -4149,7 +4150,7 @@
           <w:b/>
           <w:sz w:val="24"/>
         </w:rPr>
-        <w:t>Figure 1 | a, Updated computational workflow from image conversion and GrandQC through three-model cell consensus, TMA/ROI assignment, GigaTIME, paired UNI-2 representations, KODAMA, landmark-based Leiden clustering, spatial reconstruction, MedSAM and GeoJSON export. b, Representative H&amp;E region and cell-identification input with numeric and named per-model cell types. c, GigaTIME virtual multiplex-marker output. d, Cell-centred spatial sampling. e, Paired UNI-2 morphology encoding. f, KODAMA visualization and phenotype clustering. g, MedSAM-refined tissue compartments. The extended workflow subsequently ranks connected tissue sections by named neoplastic-cell count, derives a TITAN section embedding and performs PathoFMPred analysis. MPP, micrometres per pixel; TMA, tissue microarray; ROI, region of interest.</w:t>
+        <w:t>Figure 1 | a, Updated computational workflow from image conversion and GrandQC through three-model cell consensus, TMA/ROI assignment, GigaTIME, paired UNI-2 representations, KODAMA, landmark-based Leiden clustering, spatial reconstruction, MedSAM and GeoJSON export. b, Representative H&amp;E region and cell-identification input with numeric and named per-model cell types. c, GigaTIME virtual multiplex-marker output. d, Default spatial-grid sampling. e, Paired UNI-2 morphology encoding. f, KODAMA visualization and phenotype clustering. g, MedSAM-refined tissue compartments. The extended workflow subsequently ranks connected tissue sections by named neoplastic-cell count, derives a TITAN section embedding and performs PathoFMPred analysis. MPP, micrometres per pixel; TMA, tissue microarray; ROI, region of interest.</w:t>
       </w:r>
       <w:r>
         <w:rPr>

</xml_diff>